<commit_message>
Resume template: plain left-aligned header, SimSun font, smaller body text
Co-Authored-By: Claude Opus 5.5 <noreply@anthropic.com>
Claude-Session: https://claude.ai/code/session_01FJkXmLKjq448WfjVWXt6uX
</commit_message>
<xml_diff>
--- a/网络安全简历模板.docx
+++ b/网络安全简历模板.docx
@@ -2,89 +2,55 @@
 <file path=word/document.xml><?xml version="1.0" encoding="utf-8"?>
 <w:document xmlns:wpc="http://schemas.microsoft.com/office/word/2010/wordprocessingCanvas" xmlns:mc="http://schemas.openxmlformats.org/markup-compatibility/2006" xmlns:o="urn:schemas-microsoft-com:office:office" xmlns:r="http://schemas.openxmlformats.org/officeDocument/2006/relationships" xmlns:m="http://schemas.openxmlformats.org/officeDocument/2006/math" xmlns:v="urn:schemas-microsoft-com:vml" xmlns:wp14="http://schemas.microsoft.com/office/word/2010/wordprocessingDrawing" xmlns:wp="http://schemas.openxmlformats.org/drawingml/2006/wordprocessingDrawing" xmlns:w10="urn:schemas-microsoft-com:office:word" xmlns:w="http://schemas.openxmlformats.org/wordprocessingml/2006/main" xmlns:w14="http://schemas.microsoft.com/office/word/2010/wordml" xmlns:w15="http://schemas.microsoft.com/office/word/2012/wordml" xmlns:wpg="http://schemas.microsoft.com/office/word/2010/wordprocessingGroup" xmlns:wpi="http://schemas.microsoft.com/office/word/2010/wordprocessingInk" xmlns:wne="http://schemas.microsoft.com/office/word/2006/wordml" xmlns:wps="http://schemas.microsoft.com/office/word/2010/wordprocessingShape" xmlns:cx="http://schemas.microsoft.com/office/drawing/2014/chartex" xmlns:cx1="http://schemas.microsoft.com/office/drawing/2015/9/8/chartex" xmlns:cx2="http://schemas.microsoft.com/office/drawing/2015/10/21/chartex" xmlns:cx3="http://schemas.microsoft.com/office/drawing/2016/5/9/chartex" xmlns:cx4="http://schemas.microsoft.com/office/drawing/2016/5/10/chartex" xmlns:cx5="http://schemas.microsoft.com/office/drawing/2016/5/11/chartex" xmlns:cx6="http://schemas.microsoft.com/office/drawing/2016/5/12/chartex" xmlns:cx7="http://schemas.microsoft.com/office/drawing/2016/5/13/chartex" xmlns:cx8="http://schemas.microsoft.com/office/drawing/2016/5/14/chartex" xmlns:aink="http://schemas.microsoft.com/office/drawing/2016/ink" xmlns:am3d="http://schemas.microsoft.com/office/drawing/2017/model3d" xmlns:w16cex="http://schemas.microsoft.com/office/word/2018/wordml/cex" xmlns:w16cid="http://schemas.microsoft.com/office/word/2016/wordml/cid" xmlns:w16="http://schemas.microsoft.com/office/word/2018/wordml" xmlns:w16sdtdh="http://schemas.microsoft.com/office/word/2020/wordml/sdtdatahash" xmlns:w16se="http://schemas.microsoft.com/office/word/2015/wordml/symex" mc:Ignorable="w14 w15 wp14">
   <w:body>
-    <w:tbl>
-      <w:tblPr>
-        <w:tblW w:type="dxa" w:w="10306"/>
-        <w:tblBorders>
-          <w:top w:val="single" w:color="auto" w:sz="4"/>
-          <w:left w:val="single" w:color="auto" w:sz="4"/>
-          <w:bottom w:val="single" w:color="auto" w:sz="4"/>
-          <w:right w:val="single" w:color="auto" w:sz="4"/>
-          <w:insideH w:val="single" w:color="auto" w:sz="4"/>
-          <w:insideV w:val="single" w:color="auto" w:sz="4"/>
-        </w:tblBorders>
-      </w:tblPr>
-      <w:tblGrid>
-        <w:gridCol w:w="10306"/>
-      </w:tblGrid>
-      <w:tr>
-        <w:tc>
-          <w:tcPr>
-            <w:tcW w:type="dxa" w:w="10306"/>
-            <w:tcBorders>
-              <w:top w:val="none" w:color="FFFFFF" w:sz="0"/>
-              <w:left w:val="none" w:color="FFFFFF" w:sz="0"/>
-              <w:bottom w:val="none" w:color="FFFFFF" w:sz="0"/>
-              <w:right w:val="none" w:color="FFFFFF" w:sz="0"/>
-            </w:tcBorders>
-            <w:shd w:fill="14213D" w:color="auto" w:val="clear"/>
-            <w:tcMar>
-              <w:top w:type="dxa" w:w="260"/>
-              <w:left w:type="dxa" w:w="300"/>
-              <w:bottom w:type="dxa" w:w="240"/>
-              <w:right w:type="dxa" w:w="300"/>
-            </w:tcMar>
-          </w:tcPr>
-          <w:p>
-            <w:pPr>
-              <w:spacing w:after="60"/>
-              <w:jc w:val="center"/>
-            </w:pPr>
-            <w:r>
-              <w:rPr>
-                <w:rFonts w:ascii="Calibri" w:eastAsia="Microsoft YaHei" w:hAnsi="Calibri"/>
-                <w:b/>
-                <w:bCs/>
-                <w:color w:val="FFFFFF"/>
-                <w:spacing w:val="120"/>
-                <w:sz w:val="52"/>
-                <w:szCs w:val="52"/>
-              </w:rPr>
-              <w:t xml:space="preserve">姓　名</w:t>
-            </w:r>
-          </w:p>
-          <w:p>
-            <w:pPr>
-              <w:spacing w:after="100"/>
-              <w:jc w:val="center"/>
-            </w:pPr>
-            <w:r>
-              <w:rPr>
-                <w:rFonts w:ascii="Calibri" w:eastAsia="Microsoft YaHei" w:hAnsi="Calibri"/>
-                <w:color w:val="7FD6DC"/>
-                <w:sz w:val="22"/>
-                <w:szCs w:val="22"/>
-              </w:rPr>
-              <w:t xml:space="preserve">渗透测试工程师  ·  安全研究员  ·  安全运营（SOC）工程师</w:t>
-            </w:r>
-          </w:p>
-          <w:p>
-            <w:pPr>
-              <w:jc w:val="center"/>
-            </w:pPr>
-            <w:r>
-              <w:rPr>
-                <w:rFonts w:ascii="Calibri" w:eastAsia="Microsoft YaHei" w:hAnsi="Calibri"/>
-                <w:color w:val="E6EDF3"/>
-                <w:sz w:val="18"/>
-                <w:szCs w:val="18"/>
-              </w:rPr>
-              <w:t xml:space="preserve">138-xxxx-xxxx   ✉ name@example.com   ◎ 北京   GitHub: github.com/xxx   Blog: xxx.com</w:t>
-            </w:r>
-          </w:p>
-        </w:tc>
-      </w:tr>
-    </w:tbl>
+    <w:p>
+      <w:pPr>
+        <w:spacing w:after="60"/>
+      </w:pPr>
+      <w:r>
+        <w:rPr>
+          <w:rFonts w:ascii="Times New Roman" w:eastAsia="SimSun" w:hAnsi="Times New Roman"/>
+          <w:b/>
+          <w:bCs/>
+          <w:color w:val="14213D"/>
+          <w:sz w:val="44"/>
+          <w:szCs w:val="44"/>
+        </w:rPr>
+        <w:t xml:space="preserve">姓名</w:t>
+      </w:r>
+    </w:p>
+    <w:p>
+      <w:pPr>
+        <w:spacing w:after="60"/>
+      </w:pPr>
+      <w:r>
+        <w:rPr>
+          <w:rFonts w:ascii="Times New Roman" w:eastAsia="SimSun" w:hAnsi="Times New Roman"/>
+          <w:b/>
+          <w:bCs/>
+          <w:color w:val="262626"/>
+          <w:sz w:val="21"/>
+          <w:szCs w:val="21"/>
+        </w:rPr>
+        <w:t xml:space="preserve">求职意向：渗透测试工程师 / 安全研究员 / 安全运营（SOC）工程师</w:t>
+      </w:r>
+    </w:p>
+    <w:p>
+      <w:pPr>
+        <w:pBdr>
+          <w:bottom w:val="single" w:color="14213D" w:sz="8" w:space="6"/>
+        </w:pBdr>
+        <w:spacing w:after="40"/>
+      </w:pPr>
+      <w:r>
+        <w:rPr>
+          <w:rFonts w:ascii="Times New Roman" w:eastAsia="SimSun" w:hAnsi="Times New Roman"/>
+          <w:color w:val="595959"/>
+          <w:sz w:val="18"/>
+          <w:szCs w:val="18"/>
+        </w:rPr>
+        <w:t xml:space="preserve">手机：138-xxxx-xxxx   邮箱：name@example.com   城市：北京   GitHub：github.com/xxx   博客：xxx.com</w:t>
+      </w:r>
+    </w:p>
     <w:p>
       <w:pPr>
         <w:keepNext/>
@@ -97,7 +63,7 @@
       </w:pPr>
       <w:r>
         <w:rPr>
-          <w:rFonts w:ascii="Calibri" w:eastAsia="Microsoft YaHei" w:hAnsi="Calibri"/>
+          <w:rFonts w:ascii="Times New Roman" w:eastAsia="SimSun" w:hAnsi="Times New Roman"/>
           <w:b/>
           <w:bCs/>
           <w:color w:val="14213D"/>
@@ -115,10 +81,10 @@
       </w:pPr>
       <w:r>
         <w:rPr>
-          <w:rFonts w:ascii="Calibri" w:eastAsia="Microsoft YaHei" w:hAnsi="Calibri"/>
-          <w:color w:val="262626"/>
-          <w:sz w:val="20"/>
-          <w:szCs w:val="20"/>
+          <w:rFonts w:ascii="Times New Roman" w:eastAsia="SimSun" w:hAnsi="Times New Roman"/>
+          <w:color w:val="262626"/>
+          <w:sz w:val="18"/>
+          <w:szCs w:val="18"/>
         </w:rPr>
         <w:t xml:space="preserve">X 年网络安全从业经验，专注于 Web/内网渗透测试、漏洞挖掘与应急响应。熟悉 OWASP Top 10、ATT&amp;CK 框架及等保 2.0 / ISO 27001 合规要求；累计提交 CVE/CNVD 漏洞 X 个，主导完成 X 次红蓝对抗与 X 起安全事件处置。</w:t>
       </w:r>
@@ -135,7 +101,7 @@
       </w:pPr>
       <w:r>
         <w:rPr>
-          <w:rFonts w:ascii="Calibri" w:eastAsia="Microsoft YaHei" w:hAnsi="Calibri"/>
+          <w:rFonts w:ascii="Times New Roman" w:eastAsia="SimSun" w:hAnsi="Times New Roman"/>
           <w:b/>
           <w:bCs/>
           <w:color w:val="14213D"/>
@@ -153,21 +119,21 @@
       </w:pPr>
       <w:r>
         <w:rPr>
-          <w:rFonts w:ascii="Calibri" w:eastAsia="Microsoft YaHei" w:hAnsi="Calibri"/>
+          <w:rFonts w:ascii="Times New Roman" w:eastAsia="SimSun" w:hAnsi="Times New Roman"/>
           <w:b/>
           <w:bCs/>
           <w:color w:val="0E7C86"/>
-          <w:sz w:val="20"/>
-          <w:szCs w:val="20"/>
+          <w:sz w:val="18"/>
+          <w:szCs w:val="18"/>
         </w:rPr>
         <w:t xml:space="preserve">渗透测试  </w:t>
       </w:r>
       <w:r>
         <w:rPr>
-          <w:rFonts w:ascii="Calibri" w:eastAsia="Microsoft YaHei" w:hAnsi="Calibri"/>
-          <w:color w:val="262626"/>
-          <w:sz w:val="20"/>
-          <w:szCs w:val="20"/>
+          <w:rFonts w:ascii="Times New Roman" w:eastAsia="SimSun" w:hAnsi="Times New Roman"/>
+          <w:color w:val="262626"/>
+          <w:sz w:val="18"/>
+          <w:szCs w:val="18"/>
         </w:rPr>
         <w:t xml:space="preserve">Burp Suite、Nmap、Metasploit、Cobalt Strike、SQLMap、BloodHound；Web / 内网 / 移动端 / API 测试</w:t>
       </w:r>
@@ -179,21 +145,21 @@
       </w:pPr>
       <w:r>
         <w:rPr>
-          <w:rFonts w:ascii="Calibri" w:eastAsia="Microsoft YaHei" w:hAnsi="Calibri"/>
+          <w:rFonts w:ascii="Times New Roman" w:eastAsia="SimSun" w:hAnsi="Times New Roman"/>
           <w:b/>
           <w:bCs/>
           <w:color w:val="0E7C86"/>
-          <w:sz w:val="20"/>
-          <w:szCs w:val="20"/>
+          <w:sz w:val="18"/>
+          <w:szCs w:val="18"/>
         </w:rPr>
         <w:t xml:space="preserve">漏洞研究  </w:t>
       </w:r>
       <w:r>
         <w:rPr>
-          <w:rFonts w:ascii="Calibri" w:eastAsia="Microsoft YaHei" w:hAnsi="Calibri"/>
-          <w:color w:val="262626"/>
-          <w:sz w:val="20"/>
-          <w:szCs w:val="20"/>
+          <w:rFonts w:ascii="Times New Roman" w:eastAsia="SimSun" w:hAnsi="Times New Roman"/>
+          <w:color w:val="262626"/>
+          <w:sz w:val="18"/>
+          <w:szCs w:val="18"/>
         </w:rPr>
         <w:t xml:space="preserve">代码审计（Java/PHP/Python）、逆向分析（IDA/Ghidra）、Fuzzing、PoC/EXP 编写</w:t>
       </w:r>
@@ -205,21 +171,21 @@
       </w:pPr>
       <w:r>
         <w:rPr>
-          <w:rFonts w:ascii="Calibri" w:eastAsia="Microsoft YaHei" w:hAnsi="Calibri"/>
+          <w:rFonts w:ascii="Times New Roman" w:eastAsia="SimSun" w:hAnsi="Times New Roman"/>
           <w:b/>
           <w:bCs/>
           <w:color w:val="0E7C86"/>
-          <w:sz w:val="20"/>
-          <w:szCs w:val="20"/>
+          <w:sz w:val="18"/>
+          <w:szCs w:val="18"/>
         </w:rPr>
         <w:t xml:space="preserve">安全运营  </w:t>
       </w:r>
       <w:r>
         <w:rPr>
-          <w:rFonts w:ascii="Calibri" w:eastAsia="Microsoft YaHei" w:hAnsi="Calibri"/>
-          <w:color w:val="262626"/>
-          <w:sz w:val="20"/>
-          <w:szCs w:val="20"/>
+          <w:rFonts w:ascii="Times New Roman" w:eastAsia="SimSun" w:hAnsi="Times New Roman"/>
+          <w:color w:val="262626"/>
+          <w:sz w:val="18"/>
+          <w:szCs w:val="18"/>
         </w:rPr>
         <w:t xml:space="preserve">SIEM（Splunk/ELK/Sentinel）、EDR、WAF、NDR、威胁情报、日志分析、Sigma/YARA 规则编写</w:t>
       </w:r>
@@ -231,21 +197,21 @@
       </w:pPr>
       <w:r>
         <w:rPr>
-          <w:rFonts w:ascii="Calibri" w:eastAsia="Microsoft YaHei" w:hAnsi="Calibri"/>
+          <w:rFonts w:ascii="Times New Roman" w:eastAsia="SimSun" w:hAnsi="Times New Roman"/>
           <w:b/>
           <w:bCs/>
           <w:color w:val="0E7C86"/>
-          <w:sz w:val="20"/>
-          <w:szCs w:val="20"/>
+          <w:sz w:val="18"/>
+          <w:szCs w:val="18"/>
         </w:rPr>
         <w:t xml:space="preserve">应急响应  </w:t>
       </w:r>
       <w:r>
         <w:rPr>
-          <w:rFonts w:ascii="Calibri" w:eastAsia="Microsoft YaHei" w:hAnsi="Calibri"/>
-          <w:color w:val="262626"/>
-          <w:sz w:val="20"/>
-          <w:szCs w:val="20"/>
+          <w:rFonts w:ascii="Times New Roman" w:eastAsia="SimSun" w:hAnsi="Times New Roman"/>
+          <w:color w:val="262626"/>
+          <w:sz w:val="18"/>
+          <w:szCs w:val="18"/>
         </w:rPr>
         <w:t xml:space="preserve">主机/网络取证、恶意样本分析、勒索与挖矿处置、溯源与报告输出</w:t>
       </w:r>
@@ -257,21 +223,21 @@
       </w:pPr>
       <w:r>
         <w:rPr>
-          <w:rFonts w:ascii="Calibri" w:eastAsia="Microsoft YaHei" w:hAnsi="Calibri"/>
+          <w:rFonts w:ascii="Times New Roman" w:eastAsia="SimSun" w:hAnsi="Times New Roman"/>
           <w:b/>
           <w:bCs/>
           <w:color w:val="0E7C86"/>
-          <w:sz w:val="20"/>
-          <w:szCs w:val="20"/>
+          <w:sz w:val="18"/>
+          <w:szCs w:val="18"/>
         </w:rPr>
         <w:t xml:space="preserve">云与开发  </w:t>
       </w:r>
       <w:r>
         <w:rPr>
-          <w:rFonts w:ascii="Calibri" w:eastAsia="Microsoft YaHei" w:hAnsi="Calibri"/>
-          <w:color w:val="262626"/>
-          <w:sz w:val="20"/>
-          <w:szCs w:val="20"/>
+          <w:rFonts w:ascii="Times New Roman" w:eastAsia="SimSun" w:hAnsi="Times New Roman"/>
+          <w:color w:val="262626"/>
+          <w:sz w:val="18"/>
+          <w:szCs w:val="18"/>
         </w:rPr>
         <w:t xml:space="preserve">AWS/阿里云安全、Docker/K8s 安全、DevSecOps；Python / Go / Shell / PowerShell</w:t>
       </w:r>
@@ -288,7 +254,7 @@
       </w:pPr>
       <w:r>
         <w:rPr>
-          <w:rFonts w:ascii="Calibri" w:eastAsia="Microsoft YaHei" w:hAnsi="Calibri"/>
+          <w:rFonts w:ascii="Times New Roman" w:eastAsia="SimSun" w:hAnsi="Times New Roman"/>
           <w:b/>
           <w:bCs/>
           <w:color w:val="14213D"/>
@@ -309,32 +275,32 @@
       </w:pPr>
       <w:r>
         <w:rPr>
-          <w:rFonts w:ascii="Calibri" w:eastAsia="Microsoft YaHei" w:hAnsi="Calibri"/>
-          <w:b/>
-          <w:bCs/>
-          <w:color w:val="14213D"/>
-          <w:sz w:val="22"/>
-          <w:szCs w:val="22"/>
+          <w:rFonts w:ascii="Times New Roman" w:eastAsia="SimSun" w:hAnsi="Times New Roman"/>
+          <w:b/>
+          <w:bCs/>
+          <w:color w:val="14213D"/>
+          <w:sz w:val="21"/>
+          <w:szCs w:val="21"/>
         </w:rPr>
         <w:t xml:space="preserve">某某安全科技有限公司</w:t>
       </w:r>
       <w:r>
         <w:rPr>
-          <w:rFonts w:ascii="Calibri" w:eastAsia="Microsoft YaHei" w:hAnsi="Calibri"/>
+          <w:rFonts w:ascii="Times New Roman" w:eastAsia="SimSun" w:hAnsi="Times New Roman"/>
           <w:b/>
           <w:bCs/>
           <w:color w:val="0E7C86"/>
-          <w:sz w:val="20"/>
-          <w:szCs w:val="20"/>
-        </w:rPr>
-        <w:t xml:space="preserve">  |  高级渗透测试工程师</w:t>
-      </w:r>
-      <w:r>
-        <w:rPr>
-          <w:rFonts w:ascii="Calibri" w:eastAsia="Microsoft YaHei" w:hAnsi="Calibri"/>
-          <w:color w:val="595959"/>
           <w:sz w:val="19"/>
           <w:szCs w:val="19"/>
+        </w:rPr>
+        <w:t xml:space="preserve">  |  高级渗透测试工程师</w:t>
+      </w:r>
+      <w:r>
+        <w:rPr>
+          <w:rFonts w:ascii="Times New Roman" w:eastAsia="SimSun" w:hAnsi="Times New Roman"/>
+          <w:color w:val="595959"/>
+          <w:sz w:val="18"/>
+          <w:szCs w:val="18"/>
         </w:rPr>
         <w:t xml:space="preserve">	20XX.XX – 至今</w:t>
       </w:r>
@@ -350,10 +316,10 @@
       </w:pPr>
       <w:r>
         <w:rPr>
-          <w:rFonts w:ascii="Calibri" w:eastAsia="Microsoft YaHei" w:hAnsi="Calibri"/>
-          <w:color w:val="262626"/>
-          <w:sz w:val="20"/>
-          <w:szCs w:val="20"/>
+          <w:rFonts w:ascii="Times New Roman" w:eastAsia="SimSun" w:hAnsi="Times New Roman"/>
+          <w:color w:val="262626"/>
+          <w:sz w:val="18"/>
+          <w:szCs w:val="18"/>
         </w:rPr>
         <w:t xml:space="preserve">负责金融、政务客户的 Web、内网及云环境渗透测试，年均完成 X+ 项目，发现高危漏洞 X+ 个，修复率 XX%</w:t>
       </w:r>
@@ -369,10 +335,10 @@
       </w:pPr>
       <w:r>
         <w:rPr>
-          <w:rFonts w:ascii="Calibri" w:eastAsia="Microsoft YaHei" w:hAnsi="Calibri"/>
-          <w:color w:val="262626"/>
-          <w:sz w:val="20"/>
-          <w:szCs w:val="20"/>
+          <w:rFonts w:ascii="Times New Roman" w:eastAsia="SimSun" w:hAnsi="Times New Roman"/>
+          <w:color w:val="262626"/>
+          <w:sz w:val="18"/>
+          <w:szCs w:val="18"/>
         </w:rPr>
         <w:t xml:space="preserve">参与国家级/行业级攻防演练（红队），突破边界并拿下域控，累计获得靶标权限 X 个，团队排名第 X</w:t>
       </w:r>
@@ -388,10 +354,10 @@
       </w:pPr>
       <w:r>
         <w:rPr>
-          <w:rFonts w:ascii="Calibri" w:eastAsia="Microsoft YaHei" w:hAnsi="Calibri"/>
-          <w:color w:val="262626"/>
-          <w:sz w:val="20"/>
-          <w:szCs w:val="20"/>
+          <w:rFonts w:ascii="Times New Roman" w:eastAsia="SimSun" w:hAnsi="Times New Roman"/>
+          <w:color w:val="262626"/>
+          <w:sz w:val="18"/>
+          <w:szCs w:val="18"/>
         </w:rPr>
         <w:t xml:space="preserve">开发自动化资产发现与漏洞扫描工具（Python/Go），将重复性测试工作耗时降低 XX%</w:t>
       </w:r>
@@ -407,10 +373,10 @@
       </w:pPr>
       <w:r>
         <w:rPr>
-          <w:rFonts w:ascii="Calibri" w:eastAsia="Microsoft YaHei" w:hAnsi="Calibri"/>
-          <w:color w:val="262626"/>
-          <w:sz w:val="20"/>
-          <w:szCs w:val="20"/>
+          <w:rFonts w:ascii="Times New Roman" w:eastAsia="SimSun" w:hAnsi="Times New Roman"/>
+          <w:color w:val="262626"/>
+          <w:sz w:val="18"/>
+          <w:szCs w:val="18"/>
         </w:rPr>
         <w:t xml:space="preserve">编写渗透测试与加固报告，推动客户落地整改，协助通过等保 2.0 三级测评</w:t>
       </w:r>
@@ -425,32 +391,32 @@
       </w:pPr>
       <w:r>
         <w:rPr>
-          <w:rFonts w:ascii="Calibri" w:eastAsia="Microsoft YaHei" w:hAnsi="Calibri"/>
-          <w:b/>
-          <w:bCs/>
-          <w:color w:val="14213D"/>
-          <w:sz w:val="22"/>
-          <w:szCs w:val="22"/>
+          <w:rFonts w:ascii="Times New Roman" w:eastAsia="SimSun" w:hAnsi="Times New Roman"/>
+          <w:b/>
+          <w:bCs/>
+          <w:color w:val="14213D"/>
+          <w:sz w:val="21"/>
+          <w:szCs w:val="21"/>
         </w:rPr>
         <w:t xml:space="preserve">某某互联网公司</w:t>
       </w:r>
       <w:r>
         <w:rPr>
-          <w:rFonts w:ascii="Calibri" w:eastAsia="Microsoft YaHei" w:hAnsi="Calibri"/>
+          <w:rFonts w:ascii="Times New Roman" w:eastAsia="SimSun" w:hAnsi="Times New Roman"/>
           <w:b/>
           <w:bCs/>
           <w:color w:val="0E7C86"/>
-          <w:sz w:val="20"/>
-          <w:szCs w:val="20"/>
-        </w:rPr>
-        <w:t xml:space="preserve">  |  安全运营工程师</w:t>
-      </w:r>
-      <w:r>
-        <w:rPr>
-          <w:rFonts w:ascii="Calibri" w:eastAsia="Microsoft YaHei" w:hAnsi="Calibri"/>
-          <w:color w:val="595959"/>
           <w:sz w:val="19"/>
           <w:szCs w:val="19"/>
+        </w:rPr>
+        <w:t xml:space="preserve">  |  安全运营工程师</w:t>
+      </w:r>
+      <w:r>
+        <w:rPr>
+          <w:rFonts w:ascii="Times New Roman" w:eastAsia="SimSun" w:hAnsi="Times New Roman"/>
+          <w:color w:val="595959"/>
+          <w:sz w:val="18"/>
+          <w:szCs w:val="18"/>
         </w:rPr>
         <w:t xml:space="preserve">	20XX.XX – 20XX.XX</w:t>
       </w:r>
@@ -466,10 +432,10 @@
       </w:pPr>
       <w:r>
         <w:rPr>
-          <w:rFonts w:ascii="Calibri" w:eastAsia="Microsoft YaHei" w:hAnsi="Calibri"/>
-          <w:color w:val="262626"/>
-          <w:sz w:val="20"/>
-          <w:szCs w:val="20"/>
+          <w:rFonts w:ascii="Times New Roman" w:eastAsia="SimSun" w:hAnsi="Times New Roman"/>
+          <w:color w:val="262626"/>
+          <w:sz w:val="18"/>
+          <w:szCs w:val="18"/>
         </w:rPr>
         <w:t xml:space="preserve">负责 SOC 7×24 告警研判，日均处理告警 X 万条，误报率由 XX% 降至 XX%</w:t>
       </w:r>
@@ -485,10 +451,10 @@
       </w:pPr>
       <w:r>
         <w:rPr>
-          <w:rFonts w:ascii="Calibri" w:eastAsia="Microsoft YaHei" w:hAnsi="Calibri"/>
-          <w:color w:val="262626"/>
-          <w:sz w:val="20"/>
-          <w:szCs w:val="20"/>
+          <w:rFonts w:ascii="Times New Roman" w:eastAsia="SimSun" w:hAnsi="Times New Roman"/>
+          <w:color w:val="262626"/>
+          <w:sz w:val="18"/>
+          <w:szCs w:val="18"/>
         </w:rPr>
         <w:t xml:space="preserve">基于 ATT&amp;CK 编写检测规则 X 条，覆盖横向移动、持久化等场景，提升 MTTD XX%</w:t>
       </w:r>
@@ -504,10 +470,10 @@
       </w:pPr>
       <w:r>
         <w:rPr>
-          <w:rFonts w:ascii="Calibri" w:eastAsia="Microsoft YaHei" w:hAnsi="Calibri"/>
-          <w:color w:val="262626"/>
-          <w:sz w:val="20"/>
-          <w:szCs w:val="20"/>
+          <w:rFonts w:ascii="Times New Roman" w:eastAsia="SimSun" w:hAnsi="Times New Roman"/>
+          <w:color w:val="262626"/>
+          <w:sz w:val="18"/>
+          <w:szCs w:val="18"/>
         </w:rPr>
         <w:t xml:space="preserve">主导 X 起入侵事件应急响应（含勒索、Webshell、挖矿），平均处置时间缩短至 X 小时</w:t>
       </w:r>
@@ -524,7 +490,7 @@
       </w:pPr>
       <w:r>
         <w:rPr>
-          <w:rFonts w:ascii="Calibri" w:eastAsia="Microsoft YaHei" w:hAnsi="Calibri"/>
+          <w:rFonts w:ascii="Times New Roman" w:eastAsia="SimSun" w:hAnsi="Times New Roman"/>
           <w:b/>
           <w:bCs/>
           <w:color w:val="14213D"/>
@@ -545,21 +511,21 @@
       </w:pPr>
       <w:r>
         <w:rPr>
-          <w:rFonts w:ascii="Calibri" w:eastAsia="Microsoft YaHei" w:hAnsi="Calibri"/>
-          <w:b/>
-          <w:bCs/>
-          <w:color w:val="14213D"/>
-          <w:sz w:val="22"/>
-          <w:szCs w:val="22"/>
+          <w:rFonts w:ascii="Times New Roman" w:eastAsia="SimSun" w:hAnsi="Times New Roman"/>
+          <w:b/>
+          <w:bCs/>
+          <w:color w:val="14213D"/>
+          <w:sz w:val="21"/>
+          <w:szCs w:val="21"/>
         </w:rPr>
         <w:t xml:space="preserve">某大型银行红队攻防演练</w:t>
       </w:r>
       <w:r>
         <w:rPr>
-          <w:rFonts w:ascii="Calibri" w:eastAsia="Microsoft YaHei" w:hAnsi="Calibri"/>
+          <w:rFonts w:ascii="Times New Roman" w:eastAsia="SimSun" w:hAnsi="Times New Roman"/>
           <w:color w:val="595959"/>
-          <w:sz w:val="19"/>
-          <w:szCs w:val="19"/>
+          <w:sz w:val="18"/>
+          <w:szCs w:val="18"/>
         </w:rPr>
         <w:t xml:space="preserve">	20XX.XX – 20XX.XX</w:t>
       </w:r>
@@ -571,10 +537,10 @@
       </w:pPr>
       <w:r>
         <w:rPr>
-          <w:rFonts w:ascii="Calibri" w:eastAsia="Microsoft YaHei" w:hAnsi="Calibri"/>
+          <w:rFonts w:ascii="Times New Roman" w:eastAsia="SimSun" w:hAnsi="Times New Roman"/>
           <w:color w:val="595959"/>
-          <w:sz w:val="19"/>
-          <w:szCs w:val="19"/>
+          <w:sz w:val="17"/>
+          <w:szCs w:val="17"/>
         </w:rPr>
         <w:t xml:space="preserve">角色：红队成员  |  技术栈：Cobalt Strike、Fscan、Mimikatz、隧道代理</w:t>
       </w:r>
@@ -590,10 +556,10 @@
       </w:pPr>
       <w:r>
         <w:rPr>
-          <w:rFonts w:ascii="Calibri" w:eastAsia="Microsoft YaHei" w:hAnsi="Calibri"/>
-          <w:color w:val="262626"/>
-          <w:sz w:val="20"/>
-          <w:szCs w:val="20"/>
+          <w:rFonts w:ascii="Times New Roman" w:eastAsia="SimSun" w:hAnsi="Times New Roman"/>
+          <w:color w:val="262626"/>
+          <w:sz w:val="18"/>
+          <w:szCs w:val="18"/>
         </w:rPr>
         <w:t xml:space="preserve">通过 Web 应用漏洞获取立足点，利用弱口令与 Kerberos 委派完成内网横向并取得域控权限</w:t>
       </w:r>
@@ -609,10 +575,10 @@
       </w:pPr>
       <w:r>
         <w:rPr>
-          <w:rFonts w:ascii="Calibri" w:eastAsia="Microsoft YaHei" w:hAnsi="Calibri"/>
-          <w:color w:val="262626"/>
-          <w:sz w:val="20"/>
-          <w:szCs w:val="20"/>
+          <w:rFonts w:ascii="Times New Roman" w:eastAsia="SimSun" w:hAnsi="Times New Roman"/>
+          <w:color w:val="262626"/>
+          <w:sz w:val="18"/>
+          <w:szCs w:val="18"/>
         </w:rPr>
         <w:t xml:space="preserve">输出完整攻击链与整改建议，帮助客户修复 X 项高危风险</w:t>
       </w:r>
@@ -627,21 +593,21 @@
       </w:pPr>
       <w:r>
         <w:rPr>
-          <w:rFonts w:ascii="Calibri" w:eastAsia="Microsoft YaHei" w:hAnsi="Calibri"/>
-          <w:b/>
-          <w:bCs/>
-          <w:color w:val="14213D"/>
-          <w:sz w:val="22"/>
-          <w:szCs w:val="22"/>
+          <w:rFonts w:ascii="Times New Roman" w:eastAsia="SimSun" w:hAnsi="Times New Roman"/>
+          <w:b/>
+          <w:bCs/>
+          <w:color w:val="14213D"/>
+          <w:sz w:val="21"/>
+          <w:szCs w:val="21"/>
         </w:rPr>
         <w:t xml:space="preserve">企业安全检测平台（自研）</w:t>
       </w:r>
       <w:r>
         <w:rPr>
-          <w:rFonts w:ascii="Calibri" w:eastAsia="Microsoft YaHei" w:hAnsi="Calibri"/>
+          <w:rFonts w:ascii="Times New Roman" w:eastAsia="SimSun" w:hAnsi="Times New Roman"/>
           <w:color w:val="595959"/>
-          <w:sz w:val="19"/>
-          <w:szCs w:val="19"/>
+          <w:sz w:val="18"/>
+          <w:szCs w:val="18"/>
         </w:rPr>
         <w:t xml:space="preserve">	20XX.XX – 20XX.XX</w:t>
       </w:r>
@@ -653,10 +619,10 @@
       </w:pPr>
       <w:r>
         <w:rPr>
-          <w:rFonts w:ascii="Calibri" w:eastAsia="Microsoft YaHei" w:hAnsi="Calibri"/>
+          <w:rFonts w:ascii="Times New Roman" w:eastAsia="SimSun" w:hAnsi="Times New Roman"/>
           <w:color w:val="595959"/>
-          <w:sz w:val="19"/>
-          <w:szCs w:val="19"/>
+          <w:sz w:val="17"/>
+          <w:szCs w:val="17"/>
         </w:rPr>
         <w:t xml:space="preserve">角色：核心开发  |  技术栈：Python、Elasticsearch、Docker</w:t>
       </w:r>
@@ -672,10 +638,10 @@
       </w:pPr>
       <w:r>
         <w:rPr>
-          <w:rFonts w:ascii="Calibri" w:eastAsia="Microsoft YaHei" w:hAnsi="Calibri"/>
-          <w:color w:val="262626"/>
-          <w:sz w:val="20"/>
-          <w:szCs w:val="20"/>
+          <w:rFonts w:ascii="Times New Roman" w:eastAsia="SimSun" w:hAnsi="Times New Roman"/>
+          <w:color w:val="262626"/>
+          <w:sz w:val="18"/>
+          <w:szCs w:val="18"/>
         </w:rPr>
         <w:t xml:space="preserve">设计资产测绘 + 漏洞验证 + 报告生成一体化流程，支持 X 万级资产，已在团队内部推广使用</w:t>
       </w:r>
@@ -692,7 +658,7 @@
       </w:pPr>
       <w:r>
         <w:rPr>
-          <w:rFonts w:ascii="Calibri" w:eastAsia="Microsoft YaHei" w:hAnsi="Calibri"/>
+          <w:rFonts w:ascii="Times New Roman" w:eastAsia="SimSun" w:hAnsi="Times New Roman"/>
           <w:b/>
           <w:bCs/>
           <w:color w:val="14213D"/>
@@ -714,10 +680,10 @@
       </w:pPr>
       <w:r>
         <w:rPr>
-          <w:rFonts w:ascii="Calibri" w:eastAsia="Microsoft YaHei" w:hAnsi="Calibri"/>
-          <w:color w:val="262626"/>
-          <w:sz w:val="20"/>
-          <w:szCs w:val="20"/>
+          <w:rFonts w:ascii="Times New Roman" w:eastAsia="SimSun" w:hAnsi="Times New Roman"/>
+          <w:color w:val="262626"/>
+          <w:sz w:val="18"/>
+          <w:szCs w:val="18"/>
         </w:rPr>
         <w:t xml:space="preserve">CVE-20XX-XXXXX：某开源组件远程代码执行漏洞（CVSS 9.8）</w:t>
       </w:r>
@@ -733,10 +699,10 @@
       </w:pPr>
       <w:r>
         <w:rPr>
-          <w:rFonts w:ascii="Calibri" w:eastAsia="Microsoft YaHei" w:hAnsi="Calibri"/>
-          <w:color w:val="262626"/>
-          <w:sz w:val="20"/>
-          <w:szCs w:val="20"/>
+          <w:rFonts w:ascii="Times New Roman" w:eastAsia="SimSun" w:hAnsi="Times New Roman"/>
+          <w:color w:val="262626"/>
+          <w:sz w:val="18"/>
+          <w:szCs w:val="18"/>
         </w:rPr>
         <w:t xml:space="preserve">CNVD 原创漏洞 X 个；国内主流 SRC 年度/季度排名前 X</w:t>
       </w:r>
@@ -752,10 +718,10 @@
       </w:pPr>
       <w:r>
         <w:rPr>
-          <w:rFonts w:ascii="Calibri" w:eastAsia="Microsoft YaHei" w:hAnsi="Calibri"/>
-          <w:color w:val="262626"/>
-          <w:sz w:val="20"/>
-          <w:szCs w:val="20"/>
+          <w:rFonts w:ascii="Times New Roman" w:eastAsia="SimSun" w:hAnsi="Times New Roman"/>
+          <w:color w:val="262626"/>
+          <w:sz w:val="18"/>
+          <w:szCs w:val="18"/>
         </w:rPr>
         <w:t xml:space="preserve">CTF：20XX 年 XXX 比赛 全国第 X 名；技术博客/议题：《XXXX》（XX 大会）</w:t>
       </w:r>
@@ -772,7 +738,7 @@
       </w:pPr>
       <w:r>
         <w:rPr>
-          <w:rFonts w:ascii="Calibri" w:eastAsia="Microsoft YaHei" w:hAnsi="Calibri"/>
+          <w:rFonts w:ascii="Times New Roman" w:eastAsia="SimSun" w:hAnsi="Times New Roman"/>
           <w:b/>
           <w:bCs/>
           <w:color w:val="14213D"/>
@@ -793,33 +759,33 @@
       </w:pPr>
       <w:r>
         <w:rPr>
-          <w:rFonts w:ascii="Calibri" w:eastAsia="Microsoft YaHei" w:hAnsi="Calibri"/>
-          <w:b/>
-          <w:bCs/>
-          <w:color w:val="14213D"/>
-          <w:sz w:val="22"/>
-          <w:szCs w:val="22"/>
+          <w:rFonts w:ascii="Times New Roman" w:eastAsia="SimSun" w:hAnsi="Times New Roman"/>
+          <w:b/>
+          <w:bCs/>
+          <w:color w:val="14213D"/>
+          <w:sz w:val="21"/>
+          <w:szCs w:val="21"/>
         </w:rPr>
         <w:t xml:space="preserve">某某大学</w:t>
       </w:r>
       <w:r>
         <w:rPr>
-          <w:rFonts w:ascii="Calibri" w:eastAsia="Microsoft YaHei" w:hAnsi="Calibri"/>
+          <w:rFonts w:ascii="Times New Roman" w:eastAsia="SimSun" w:hAnsi="Times New Roman"/>
           <w:b/>
           <w:bCs/>
           <w:color w:val="0E7C86"/>
-          <w:sz w:val="20"/>
-          <w:szCs w:val="20"/>
-        </w:rPr>
-        <w:t xml:space="preserve">  |  网络空间安全 / 信息安全  |  本科/硕士</w:t>
-      </w:r>
-      <w:r>
-        <w:rPr>
-          <w:rFonts w:ascii="Calibri" w:eastAsia="Microsoft YaHei" w:hAnsi="Calibri"/>
-          <w:color w:val="595959"/>
           <w:sz w:val="19"/>
           <w:szCs w:val="19"/>
         </w:rPr>
+        <w:t xml:space="preserve">  |  网络空间安全 / 信息安全  |  本科/硕士</w:t>
+      </w:r>
+      <w:r>
+        <w:rPr>
+          <w:rFonts w:ascii="Times New Roman" w:eastAsia="SimSun" w:hAnsi="Times New Roman"/>
+          <w:color w:val="595959"/>
+          <w:sz w:val="18"/>
+          <w:szCs w:val="18"/>
+        </w:rPr>
         <w:t xml:space="preserve">	20XX.09 – 20XX.06</w:t>
       </w:r>
     </w:p>
@@ -830,10 +796,10 @@
       </w:pPr>
       <w:r>
         <w:rPr>
-          <w:rFonts w:ascii="Calibri" w:eastAsia="Microsoft YaHei" w:hAnsi="Calibri"/>
-          <w:color w:val="262626"/>
-          <w:sz w:val="20"/>
-          <w:szCs w:val="20"/>
+          <w:rFonts w:ascii="Times New Roman" w:eastAsia="SimSun" w:hAnsi="Times New Roman"/>
+          <w:color w:val="262626"/>
+          <w:sz w:val="18"/>
+          <w:szCs w:val="18"/>
         </w:rPr>
         <w:t xml:space="preserve">主修：密码学、操作系统安全、网络攻防、恶意代码分析；GPA X.X/4.0；奖学金 / 优秀毕业生</w:t>
       </w:r>
@@ -850,7 +816,7 @@
       </w:pPr>
       <w:r>
         <w:rPr>
-          <w:rFonts w:ascii="Calibri" w:eastAsia="Microsoft YaHei" w:hAnsi="Calibri"/>
+          <w:rFonts w:ascii="Times New Roman" w:eastAsia="SimSun" w:hAnsi="Times New Roman"/>
           <w:b/>
           <w:bCs/>
           <w:color w:val="14213D"/>
@@ -868,10 +834,10 @@
       </w:pPr>
       <w:r>
         <w:rPr>
-          <w:rFonts w:ascii="Calibri" w:eastAsia="Microsoft YaHei" w:hAnsi="Calibri"/>
-          <w:color w:val="262626"/>
-          <w:sz w:val="20"/>
-          <w:szCs w:val="20"/>
+          <w:rFonts w:ascii="Times New Roman" w:eastAsia="SimSun" w:hAnsi="Times New Roman"/>
+          <w:color w:val="262626"/>
+          <w:sz w:val="18"/>
+          <w:szCs w:val="18"/>
         </w:rPr>
         <w:t xml:space="preserve">CISSP · OSCP · CISP-PTE · CISP · CEH · 软考信息安全工程师 · CCSK（按实际填写，仅保留已获得）</w:t>
       </w:r>
@@ -888,7 +854,7 @@
       </w:pPr>
       <w:r>
         <w:rPr>
-          <w:rFonts w:ascii="Calibri" w:eastAsia="Microsoft YaHei" w:hAnsi="Calibri"/>
+          <w:rFonts w:ascii="Times New Roman" w:eastAsia="SimSun" w:hAnsi="Times New Roman"/>
           <w:b/>
           <w:bCs/>
           <w:color w:val="14213D"/>
@@ -906,10 +872,10 @@
       </w:pPr>
       <w:r>
         <w:rPr>
-          <w:rFonts w:ascii="Calibri" w:eastAsia="Microsoft YaHei" w:hAnsi="Calibri"/>
-          <w:color w:val="262626"/>
-          <w:sz w:val="20"/>
-          <w:szCs w:val="20"/>
+          <w:rFonts w:ascii="Times New Roman" w:eastAsia="SimSun" w:hAnsi="Times New Roman"/>
+          <w:color w:val="262626"/>
+          <w:sz w:val="18"/>
+          <w:szCs w:val="18"/>
         </w:rPr>
         <w:t xml:space="preserve">具备扎实的攻防实战能力与良好的报告写作能力；善于学习新技术，注重职业道德，严格遵守授权测试与保密原则。</w:t>
       </w:r>

</xml_diff>